<commit_message>
Strict file rules: save every file into the folder as it is made, real files only, nothing locked
Co-Authored-By: Claude Opus 5.5 <noreply@anthropic.com>
Claude-Session: https://claude.ai/code/session_01MinGEGn6eBTPUff1swBF2k
</commit_message>
<xml_diff>
--- a/AUDIT_PACK_2026-10-18/00_START_HERE_Master_Audit.docx
+++ b/AUDIT_PACK_2026-10-18/00_START_HERE_Master_Audit.docx
@@ -7250,6 +7250,122 @@
                 <w:szCs w:val="18"/>
               </w:rPr>
               <w:t xml:space="preserve">The original file as made (a web page with a .doc name). Kept for the record.</w:t>
+            </w:r>
+          </w:p>
+        </w:tc>
+      </w:tr>
+      <w:tr>
+        <w:tc>
+          <w:tcPr>
+            <w:tcW w:type="dxa" w:w="3800"/>
+            <w:tcBorders>
+              <w:top w:val="single" w:color="A0A0A0" w:sz="4"/>
+              <w:left w:val="single" w:color="A0A0A0" w:sz="4"/>
+              <w:bottom w:val="single" w:color="A0A0A0" w:sz="4"/>
+              <w:right w:val="single" w:color="A0A0A0" w:sz="4"/>
+            </w:tcBorders>
+            <w:tcMar>
+              <w:top w:type="dxa" w:w="60"/>
+              <w:left w:type="dxa" w:w="100"/>
+              <w:bottom w:type="dxa" w:w="60"/>
+              <w:right w:type="dxa" w:w="100"/>
+            </w:tcMar>
+          </w:tcPr>
+          <w:p>
+            <w:r>
+              <w:rPr>
+                <w:b w:val="false"/>
+                <w:bCs w:val="false"/>
+                <w:sz w:val="18"/>
+                <w:szCs w:val="18"/>
+              </w:rPr>
+              <w:t xml:space="preserve">7_Strict_File_Rules (.docx, .md)</w:t>
+            </w:r>
+          </w:p>
+        </w:tc>
+        <w:tc>
+          <w:tcPr>
+            <w:tcW w:type="dxa" w:w="5560"/>
+            <w:tcBorders>
+              <w:top w:val="single" w:color="A0A0A0" w:sz="4"/>
+              <w:left w:val="single" w:color="A0A0A0" w:sz="4"/>
+              <w:bottom w:val="single" w:color="A0A0A0" w:sz="4"/>
+              <w:right w:val="single" w:color="A0A0A0" w:sz="4"/>
+            </w:tcBorders>
+            <w:tcMar>
+              <w:top w:type="dxa" w:w="60"/>
+              <w:left w:type="dxa" w:w="100"/>
+              <w:bottom w:type="dxa" w:w="60"/>
+              <w:right w:type="dxa" w:w="100"/>
+            </w:tcMar>
+          </w:tcPr>
+          <w:p>
+            <w:r>
+              <w:rPr>
+                <w:b w:val="false"/>
+                <w:bCs w:val="false"/>
+                <w:sz w:val="18"/>
+                <w:szCs w:val="18"/>
+              </w:rPr>
+              <w:t xml:space="preserve">Your standing rules for every AI session: real files saved into the folder as they are made, never links, nothing locked or permission-blocked. Same text as CLAUDE.md at the top of the repo, which sessions read automatically.</w:t>
+            </w:r>
+          </w:p>
+        </w:tc>
+      </w:tr>
+      <w:tr>
+        <w:tc>
+          <w:tcPr>
+            <w:tcW w:type="dxa" w:w="3800"/>
+            <w:tcBorders>
+              <w:top w:val="single" w:color="A0A0A0" w:sz="4"/>
+              <w:left w:val="single" w:color="A0A0A0" w:sz="4"/>
+              <w:bottom w:val="single" w:color="A0A0A0" w:sz="4"/>
+              <w:right w:val="single" w:color="A0A0A0" w:sz="4"/>
+            </w:tcBorders>
+            <w:tcMar>
+              <w:top w:type="dxa" w:w="60"/>
+              <w:left w:type="dxa" w:w="100"/>
+              <w:bottom w:type="dxa" w:w="60"/>
+              <w:right w:type="dxa" w:w="100"/>
+            </w:tcMar>
+          </w:tcPr>
+          <w:p>
+            <w:r>
+              <w:rPr>
+                <w:b w:val="false"/>
+                <w:bCs w:val="false"/>
+                <w:sz w:val="18"/>
+                <w:szCs w:val="18"/>
+              </w:rPr>
+              <w:t xml:space="preserve">8_Build_Scripts/build_master_doc.js</w:t>
+            </w:r>
+          </w:p>
+        </w:tc>
+        <w:tc>
+          <w:tcPr>
+            <w:tcW w:type="dxa" w:w="5560"/>
+            <w:tcBorders>
+              <w:top w:val="single" w:color="A0A0A0" w:sz="4"/>
+              <w:left w:val="single" w:color="A0A0A0" w:sz="4"/>
+              <w:bottom w:val="single" w:color="A0A0A0" w:sz="4"/>
+              <w:right w:val="single" w:color="A0A0A0" w:sz="4"/>
+            </w:tcBorders>
+            <w:tcMar>
+              <w:top w:type="dxa" w:w="60"/>
+              <w:left w:type="dxa" w:w="100"/>
+              <w:bottom w:type="dxa" w:w="60"/>
+              <w:right w:type="dxa" w:w="100"/>
+            </w:tcMar>
+          </w:tcPr>
+          <w:p>
+            <w:r>
+              <w:rPr>
+                <w:b w:val="false"/>
+                <w:bCs w:val="false"/>
+                <w:sz w:val="18"/>
+                <w:szCs w:val="18"/>
+              </w:rPr>
+              <w:t xml:space="preserve">The script that builds this master doc (run: node build_master_doc.js out.docx). Kept so anyone can rebuild or check it.</w:t>
             </w:r>
           </w:p>
         </w:tc>

</xml_diff>

<commit_message>
Correct audit: repository is public (MIT), not private; add to what-went-wrong list
Co-Authored-By: Claude Opus 5.5 <noreply@anthropic.com>
Claude-Session: https://claude.ai/code/session_01MinGEGn6eBTPUff1swBF2k
</commit_message>
<xml_diff>
--- a/AUDIT_PACK_2026-10-18/00_START_HERE_Master_Audit.docx
+++ b/AUDIT_PACK_2026-10-18/00_START_HERE_Master_Audit.docx
@@ -4680,6 +4680,120 @@
                 <w:sz w:val="18"/>
                 <w:szCs w:val="18"/>
               </w:rPr>
+              <w:t xml:space="preserve">Public repository</w:t>
+            </w:r>
+          </w:p>
+        </w:tc>
+        <w:tc>
+          <w:tcPr>
+            <w:tcW w:type="dxa" w:w="3360"/>
+            <w:tcBorders>
+              <w:top w:val="single" w:color="A0A0A0" w:sz="4"/>
+              <w:left w:val="single" w:color="A0A0A0" w:sz="4"/>
+              <w:bottom w:val="single" w:color="A0A0A0" w:sz="4"/>
+              <w:right w:val="single" w:color="A0A0A0" w:sz="4"/>
+            </w:tcBorders>
+            <w:tcMar>
+              <w:top w:type="dxa" w:w="60"/>
+              <w:left w:type="dxa" w:w="100"/>
+              <w:bottom w:type="dxa" w:w="60"/>
+              <w:right w:type="dxa" w:w="100"/>
+            </w:tcMar>
+          </w:tcPr>
+          <w:p>
+            <w:r>
+              <w:rPr>
+                <w:b w:val="false"/>
+                <w:bCs w:val="false"/>
+                <w:sz w:val="18"/>
+                <w:szCs w:val="18"/>
+              </w:rPr>
+              <w:t xml:space="preserve">The repository is public, with an MIT license. Everything in it, including the zine "patent-ready" file with your email address, is readable by anyone. This audit first said "private", which was wrong.</w:t>
+            </w:r>
+          </w:p>
+        </w:tc>
+        <w:tc>
+          <w:tcPr>
+            <w:tcW w:type="dxa" w:w="2000"/>
+            <w:tcBorders>
+              <w:top w:val="single" w:color="A0A0A0" w:sz="4"/>
+              <w:left w:val="single" w:color="A0A0A0" w:sz="4"/>
+              <w:bottom w:val="single" w:color="A0A0A0" w:sz="4"/>
+              <w:right w:val="single" w:color="A0A0A0" w:sz="4"/>
+            </w:tcBorders>
+            <w:tcMar>
+              <w:top w:type="dxa" w:w="60"/>
+              <w:left w:type="dxa" w:w="100"/>
+              <w:bottom w:type="dxa" w:w="60"/>
+              <w:right w:type="dxa" w:w="100"/>
+            </w:tcMar>
+          </w:tcPr>
+          <w:p>
+            <w:r>
+              <w:rPr>
+                <w:b w:val="false"/>
+                <w:bCs w:val="false"/>
+                <w:sz w:val="18"/>
+                <w:szCs w:val="18"/>
+              </w:rPr>
+              <w:t xml:space="preserve">GitHub repository settings (visibility: public)</w:t>
+            </w:r>
+          </w:p>
+        </w:tc>
+        <w:tc>
+          <w:tcPr>
+            <w:tcW w:type="dxa" w:w="2400"/>
+            <w:tcBorders>
+              <w:top w:val="single" w:color="A0A0A0" w:sz="4"/>
+              <w:left w:val="single" w:color="A0A0A0" w:sz="4"/>
+              <w:bottom w:val="single" w:color="A0A0A0" w:sz="4"/>
+              <w:right w:val="single" w:color="A0A0A0" w:sz="4"/>
+            </w:tcBorders>
+            <w:tcMar>
+              <w:top w:type="dxa" w:w="60"/>
+              <w:left w:type="dxa" w:w="100"/>
+              <w:bottom w:type="dxa" w:w="60"/>
+              <w:right w:type="dxa" w:w="100"/>
+            </w:tcMar>
+          </w:tcPr>
+          <w:p>
+            <w:r>
+              <w:rPr>
+                <w:b w:val="false"/>
+                <w:bCs w:val="false"/>
+                <w:sz w:val="18"/>
+                <w:szCs w:val="18"/>
+              </w:rPr>
+              <w:t xml:space="preserve">Your decision. If you plan a patent, ask a patent attorney before anything more is made public. To change: GitHub, Settings, Danger Zone, Change visibility.</w:t>
+            </w:r>
+          </w:p>
+        </w:tc>
+      </w:tr>
+      <w:tr>
+        <w:tc>
+          <w:tcPr>
+            <w:tcW w:type="dxa" w:w="1600"/>
+            <w:tcBorders>
+              <w:top w:val="single" w:color="A0A0A0" w:sz="4"/>
+              <w:left w:val="single" w:color="A0A0A0" w:sz="4"/>
+              <w:bottom w:val="single" w:color="A0A0A0" w:sz="4"/>
+              <w:right w:val="single" w:color="A0A0A0" w:sz="4"/>
+            </w:tcBorders>
+            <w:tcMar>
+              <w:top w:type="dxa" w:w="60"/>
+              <w:left w:type="dxa" w:w="100"/>
+              <w:bottom w:type="dxa" w:w="60"/>
+              <w:right w:type="dxa" w:w="100"/>
+            </w:tcMar>
+          </w:tcPr>
+          <w:p>
+            <w:r>
+              <w:rPr>
+                <w:b w:val="false"/>
+                <w:bCs w:val="false"/>
+                <w:sz w:val="18"/>
+                <w:szCs w:val="18"/>
+              </w:rPr>
               <w:t xml:space="preserve">Review missed things</w:t>
             </w:r>
           </w:p>
@@ -5700,7 +5814,7 @@
                 <w:sz w:val="18"/>
                 <w:szCs w:val="18"/>
               </w:rPr>
-              <w:t xml:space="preserve">github.com/croblade47/utensil-theories-transfer-protocol (private)</w:t>
+              <w:t xml:space="preserve">github.com/croblade47/utensil-theories-transfer-protocol. Owner: croblade47 (Garrett Gauthier's GitHub account, sole admin). PUBLIC: anyone on the internet can read it. MIT license: anyone may reuse the code.</w:t>
             </w:r>
           </w:p>
         </w:tc>

</xml_diff>

<commit_message>
Audit pack: add Aesop outcome, recovered first long-story runs, corrected notes; keep as-audited copies
Claude-Session: https://claude.ai/code/session_01MinGEGn6eBTPUff1swBF2k
</commit_message>
<xml_diff>
--- a/AUDIT_PACK_2026-10-18/00_START_HERE_Master_Audit.docx
+++ b/AUDIT_PACK_2026-10-18/00_START_HERE_Master_Audit.docx
@@ -96,6 +96,26 @@
           <w:b/>
           <w:bCs/>
         </w:rPr>
+        <w:t xml:space="preserve">Aesop test (finished 07:34): </w:t>
+      </w:r>
+      <w:r>
+        <w:t xml:space="preserve">all four checks failed. In this small model, folk tales did not teach morals that carry over to fables it had never seen.</w:t>
+      </w:r>
+    </w:p>
+    <w:p>
+      <w:pPr>
+        <w:pStyle w:val="ListParagraph"/>
+        <w:numPr>
+          <w:ilvl w:val="0"/>
+          <w:numId w:val="2"/>
+        </w:numPr>
+        <w:spacing w:after="60"/>
+      </w:pPr>
+      <w:r>
+        <w:rPr>
+          <w:b/>
+          <w:bCs/>
+        </w:rPr>
         <w:t xml:space="preserve">Numbers: </w:t>
       </w:r>
       <w:r>
@@ -1947,7 +1967,7 @@
                 <w:sz w:val="18"/>
                 <w:szCs w:val="18"/>
               </w:rPr>
-              <w:t xml:space="preserve">Still running at audit time</w:t>
+              <w:t xml:space="preserve">Finished 07:34 (see below)</w:t>
             </w:r>
           </w:p>
         </w:tc>
@@ -2422,7 +2442,7 @@
                 <w:sz w:val="18"/>
                 <w:szCs w:val="18"/>
               </w:rPr>
-              <w:t xml:space="preserve">PROBLEM: design changed after peeking; evidence lost</w:t>
+              <w:t xml:space="preserve">PROBLEM: design changed after peeking. First-run results recovered later (see 07:35)</w:t>
             </w:r>
           </w:p>
         </w:tc>
@@ -3098,6 +3118,723 @@
                 <w:szCs w:val="18"/>
               </w:rPr>
               <w:t xml:space="preserve">this folder</w:t>
+            </w:r>
+          </w:p>
+        </w:tc>
+        <w:tc>
+          <w:tcPr>
+            <w:tcW w:type="dxa" w:w="2000"/>
+            <w:tcBorders>
+              <w:top w:val="single" w:color="A0A0A0" w:sz="4"/>
+              <w:left w:val="single" w:color="A0A0A0" w:sz="4"/>
+              <w:bottom w:val="single" w:color="A0A0A0" w:sz="4"/>
+              <w:right w:val="single" w:color="A0A0A0" w:sz="4"/>
+            </w:tcBorders>
+            <w:tcMar>
+              <w:top w:type="dxa" w:w="60"/>
+              <w:left w:type="dxa" w:w="100"/>
+              <w:bottom w:type="dxa" w:w="60"/>
+              <w:right w:type="dxa" w:w="100"/>
+            </w:tcMar>
+          </w:tcPr>
+          <w:p>
+            <w:r>
+              <w:rPr>
+                <w:b w:val="false"/>
+                <w:bCs w:val="false"/>
+                <w:sz w:val="18"/>
+                <w:szCs w:val="18"/>
+              </w:rPr>
+              <w:t xml:space="preserve"/>
+            </w:r>
+          </w:p>
+        </w:tc>
+      </w:tr>
+      <w:tr>
+        <w:tc>
+          <w:tcPr>
+            <w:tcW w:type="dxa" w:w="1400"/>
+            <w:tcBorders>
+              <w:top w:val="single" w:color="A0A0A0" w:sz="4"/>
+              <w:left w:val="single" w:color="A0A0A0" w:sz="4"/>
+              <w:bottom w:val="single" w:color="A0A0A0" w:sz="4"/>
+              <w:right w:val="single" w:color="A0A0A0" w:sz="4"/>
+            </w:tcBorders>
+            <w:tcMar>
+              <w:top w:type="dxa" w:w="60"/>
+              <w:left w:type="dxa" w:w="100"/>
+              <w:bottom w:type="dxa" w:w="60"/>
+              <w:right w:type="dxa" w:w="100"/>
+            </w:tcMar>
+          </w:tcPr>
+          <w:p>
+            <w:r>
+              <w:rPr>
+                <w:b w:val="false"/>
+                <w:bCs w:val="false"/>
+                <w:sz w:val="18"/>
+                <w:szCs w:val="18"/>
+              </w:rPr>
+              <w:t xml:space="preserve">18 Oct 06:52</w:t>
+            </w:r>
+          </w:p>
+        </w:tc>
+        <w:tc>
+          <w:tcPr>
+            <w:tcW w:type="dxa" w:w="4160"/>
+            <w:tcBorders>
+              <w:top w:val="single" w:color="A0A0A0" w:sz="4"/>
+              <w:left w:val="single" w:color="A0A0A0" w:sz="4"/>
+              <w:bottom w:val="single" w:color="A0A0A0" w:sz="4"/>
+              <w:right w:val="single" w:color="A0A0A0" w:sz="4"/>
+            </w:tcBorders>
+            <w:tcMar>
+              <w:top w:type="dxa" w:w="60"/>
+              <w:left w:type="dxa" w:w="100"/>
+              <w:bottom w:type="dxa" w:w="60"/>
+              <w:right w:type="dxa" w:w="100"/>
+            </w:tcMar>
+          </w:tcPr>
+          <w:p>
+            <w:r>
+              <w:rPr>
+                <w:b w:val="false"/>
+                <w:bCs w:val="false"/>
+                <w:sz w:val="18"/>
+                <w:szCs w:val="18"/>
+              </w:rPr>
+              <w:t xml:space="preserve">Audit prompt, approved by the owner, sent to the test session. It re-checked the audit numbers, found them correct, and agreed to the steps.</w:t>
+            </w:r>
+          </w:p>
+        </w:tc>
+        <w:tc>
+          <w:tcPr>
+            <w:tcW w:type="dxa" w:w="1800"/>
+            <w:tcBorders>
+              <w:top w:val="single" w:color="A0A0A0" w:sz="4"/>
+              <w:left w:val="single" w:color="A0A0A0" w:sz="4"/>
+              <w:bottom w:val="single" w:color="A0A0A0" w:sz="4"/>
+              <w:right w:val="single" w:color="A0A0A0" w:sz="4"/>
+            </w:tcBorders>
+            <w:tcMar>
+              <w:top w:type="dxa" w:w="60"/>
+              <w:left w:type="dxa" w:w="100"/>
+              <w:bottom w:type="dxa" w:w="60"/>
+              <w:right w:type="dxa" w:w="100"/>
+            </w:tcMar>
+          </w:tcPr>
+          <w:p>
+            <w:r>
+              <w:rPr>
+                <w:b w:val="false"/>
+                <w:bCs w:val="false"/>
+                <w:sz w:val="18"/>
+                <w:szCs w:val="18"/>
+              </w:rPr>
+              <w:t xml:space="preserve">send_message</w:t>
+            </w:r>
+          </w:p>
+          <w:p>
+            <w:r>
+              <w:rPr>
+                <w:b w:val="false"/>
+                <w:bCs w:val="false"/>
+                <w:sz w:val="18"/>
+                <w:szCs w:val="18"/>
+              </w:rPr>
+              <w:t xml:space="preserve">1_Prompt_for_Other_AI</w:t>
+            </w:r>
+          </w:p>
+        </w:tc>
+        <w:tc>
+          <w:tcPr>
+            <w:tcW w:type="dxa" w:w="2000"/>
+            <w:tcBorders>
+              <w:top w:val="single" w:color="A0A0A0" w:sz="4"/>
+              <w:left w:val="single" w:color="A0A0A0" w:sz="4"/>
+              <w:bottom w:val="single" w:color="A0A0A0" w:sz="4"/>
+              <w:right w:val="single" w:color="A0A0A0" w:sz="4"/>
+            </w:tcBorders>
+            <w:tcMar>
+              <w:top w:type="dxa" w:w="60"/>
+              <w:left w:type="dxa" w:w="100"/>
+              <w:bottom w:type="dxa" w:w="60"/>
+              <w:right w:type="dxa" w:w="100"/>
+            </w:tcMar>
+          </w:tcPr>
+          <w:p>
+            <w:r>
+              <w:rPr>
+                <w:b w:val="false"/>
+                <w:bCs w:val="false"/>
+                <w:sz w:val="18"/>
+                <w:szCs w:val="18"/>
+              </w:rPr>
+              <w:t xml:space="preserve"/>
+            </w:r>
+          </w:p>
+        </w:tc>
+      </w:tr>
+      <w:tr>
+        <w:tc>
+          <w:tcPr>
+            <w:tcW w:type="dxa" w:w="1400"/>
+            <w:tcBorders>
+              <w:top w:val="single" w:color="A0A0A0" w:sz="4"/>
+              <w:left w:val="single" w:color="A0A0A0" w:sz="4"/>
+              <w:bottom w:val="single" w:color="A0A0A0" w:sz="4"/>
+              <w:right w:val="single" w:color="A0A0A0" w:sz="4"/>
+            </w:tcBorders>
+            <w:tcMar>
+              <w:top w:type="dxa" w:w="60"/>
+              <w:left w:type="dxa" w:w="100"/>
+              <w:bottom w:type="dxa" w:w="60"/>
+              <w:right w:type="dxa" w:w="100"/>
+            </w:tcMar>
+          </w:tcPr>
+          <w:p>
+            <w:r>
+              <w:rPr>
+                <w:b w:val="false"/>
+                <w:bCs w:val="false"/>
+                <w:sz w:val="18"/>
+                <w:szCs w:val="18"/>
+              </w:rPr>
+              <w:t xml:space="preserve">18 Oct 07:33-07:34</w:t>
+            </w:r>
+          </w:p>
+        </w:tc>
+        <w:tc>
+          <w:tcPr>
+            <w:tcW w:type="dxa" w:w="4160"/>
+            <w:tcBorders>
+              <w:top w:val="single" w:color="A0A0A0" w:sz="4"/>
+              <w:left w:val="single" w:color="A0A0A0" w:sz="4"/>
+              <w:bottom w:val="single" w:color="A0A0A0" w:sz="4"/>
+              <w:right w:val="single" w:color="A0A0A0" w:sz="4"/>
+            </w:tcBorders>
+            <w:tcMar>
+              <w:top w:type="dxa" w:w="60"/>
+              <w:left w:type="dxa" w:w="100"/>
+              <w:bottom w:type="dxa" w:w="60"/>
+              <w:right w:type="dxa" w:w="100"/>
+            </w:tcMar>
+          </w:tcPr>
+          <w:p>
+            <w:r>
+              <w:rPr>
+                <w:b w:val="false"/>
+                <w:bCs w:val="false"/>
+                <w:sz w:val="18"/>
+                <w:szCs w:val="18"/>
+              </w:rPr>
+              <w:t xml:space="preserve">Aesop test finished (16 models). All four pre-registered checks NOT CONFIRMED: folk tales 52.3, novels 54.1, shuffled tales 53.1, Bible 43.6 right per 100 (50 = chance).</w:t>
+            </w:r>
+          </w:p>
+        </w:tc>
+        <w:tc>
+          <w:tcPr>
+            <w:tcW w:type="dxa" w:w="1800"/>
+            <w:tcBorders>
+              <w:top w:val="single" w:color="A0A0A0" w:sz="4"/>
+              <w:left w:val="single" w:color="A0A0A0" w:sz="4"/>
+              <w:bottom w:val="single" w:color="A0A0A0" w:sz="4"/>
+              <w:right w:val="single" w:color="A0A0A0" w:sz="4"/>
+            </w:tcBorders>
+            <w:tcMar>
+              <w:top w:type="dxa" w:w="60"/>
+              <w:left w:type="dxa" w:w="100"/>
+              <w:bottom w:type="dxa" w:w="60"/>
+              <w:right w:type="dxa" w:w="100"/>
+            </w:tcMar>
+          </w:tcPr>
+          <w:p>
+            <w:r>
+              <w:rPr>
+                <w:b w:val="false"/>
+                <w:bCs w:val="false"/>
+                <w:sz w:val="18"/>
+                <w:szCs w:val="18"/>
+              </w:rPr>
+              <w:t xml:space="preserve">7fdad39, 29a94aa</w:t>
+            </w:r>
+          </w:p>
+          <w:p>
+            <w:r>
+              <w:rPr>
+                <w:b w:val="false"/>
+                <w:bCs w:val="false"/>
+                <w:sz w:val="18"/>
+                <w:szCs w:val="18"/>
+              </w:rPr>
+              <w:t xml:space="preserve">results_aesop.txt</w:t>
+            </w:r>
+          </w:p>
+        </w:tc>
+        <w:tc>
+          <w:tcPr>
+            <w:tcW w:type="dxa" w:w="2000"/>
+            <w:tcBorders>
+              <w:top w:val="single" w:color="A0A0A0" w:sz="4"/>
+              <w:left w:val="single" w:color="A0A0A0" w:sz="4"/>
+              <w:bottom w:val="single" w:color="A0A0A0" w:sz="4"/>
+              <w:right w:val="single" w:color="A0A0A0" w:sz="4"/>
+            </w:tcBorders>
+            <w:tcMar>
+              <w:top w:type="dxa" w:w="60"/>
+              <w:left w:type="dxa" w:w="100"/>
+              <w:bottom w:type="dxa" w:w="60"/>
+              <w:right w:type="dxa" w:w="100"/>
+            </w:tcMar>
+          </w:tcPr>
+          <w:p>
+            <w:r>
+              <w:rPr>
+                <w:b w:val="false"/>
+                <w:bCs w:val="false"/>
+                <w:sz w:val="18"/>
+                <w:szCs w:val="18"/>
+              </w:rPr>
+              <w:t xml:space="preserve">Failure, reported plainly</w:t>
+            </w:r>
+          </w:p>
+        </w:tc>
+      </w:tr>
+      <w:tr>
+        <w:tc>
+          <w:tcPr>
+            <w:tcW w:type="dxa" w:w="1400"/>
+            <w:tcBorders>
+              <w:top w:val="single" w:color="A0A0A0" w:sz="4"/>
+              <w:left w:val="single" w:color="A0A0A0" w:sz="4"/>
+              <w:bottom w:val="single" w:color="A0A0A0" w:sz="4"/>
+              <w:right w:val="single" w:color="A0A0A0" w:sz="4"/>
+            </w:tcBorders>
+            <w:tcMar>
+              <w:top w:type="dxa" w:w="60"/>
+              <w:left w:type="dxa" w:w="100"/>
+              <w:bottom w:type="dxa" w:w="60"/>
+              <w:right w:type="dxa" w:w="100"/>
+            </w:tcMar>
+          </w:tcPr>
+          <w:p>
+            <w:r>
+              <w:rPr>
+                <w:b w:val="false"/>
+                <w:bCs w:val="false"/>
+                <w:sz w:val="18"/>
+                <w:szCs w:val="18"/>
+              </w:rPr>
+              <w:t xml:space="preserve">18 Oct 07:35</w:t>
+            </w:r>
+          </w:p>
+        </w:tc>
+        <w:tc>
+          <w:tcPr>
+            <w:tcW w:type="dxa" w:w="4160"/>
+            <w:tcBorders>
+              <w:top w:val="single" w:color="A0A0A0" w:sz="4"/>
+              <w:left w:val="single" w:color="A0A0A0" w:sz="4"/>
+              <w:bottom w:val="single" w:color="A0A0A0" w:sz="4"/>
+              <w:right w:val="single" w:color="A0A0A0" w:sz="4"/>
+            </w:tcBorders>
+            <w:tcMar>
+              <w:top w:type="dxa" w:w="60"/>
+              <w:left w:type="dxa" w:w="100"/>
+              <w:bottom w:type="dxa" w:w="60"/>
+              <w:right w:type="dxa" w:w="100"/>
+            </w:tcMar>
+          </w:tcPr>
+          <w:p>
+            <w:r>
+              <w:rPr>
+                <w:b w:val="false"/>
+                <w:bCs w:val="false"/>
+                <w:sz w:val="18"/>
+                <w:szCs w:val="18"/>
+              </w:rPr>
+              <w:t xml:space="preserve">Audit corrections applied to HANDOFF, README and PLAN (two commits; one item was missed on the first pass).</w:t>
+            </w:r>
+          </w:p>
+        </w:tc>
+        <w:tc>
+          <w:tcPr>
+            <w:tcW w:type="dxa" w:w="1800"/>
+            <w:tcBorders>
+              <w:top w:val="single" w:color="A0A0A0" w:sz="4"/>
+              <w:left w:val="single" w:color="A0A0A0" w:sz="4"/>
+              <w:bottom w:val="single" w:color="A0A0A0" w:sz="4"/>
+              <w:right w:val="single" w:color="A0A0A0" w:sz="4"/>
+            </w:tcBorders>
+            <w:tcMar>
+              <w:top w:type="dxa" w:w="60"/>
+              <w:left w:type="dxa" w:w="100"/>
+              <w:bottom w:type="dxa" w:w="60"/>
+              <w:right w:type="dxa" w:w="100"/>
+            </w:tcMar>
+          </w:tcPr>
+          <w:p>
+            <w:r>
+              <w:rPr>
+                <w:b w:val="false"/>
+                <w:bCs w:val="false"/>
+                <w:sz w:val="18"/>
+                <w:szCs w:val="18"/>
+              </w:rPr>
+              <w:t xml:space="preserve">2a58b61, 6bfa507</w:t>
+            </w:r>
+          </w:p>
+        </w:tc>
+        <w:tc>
+          <w:tcPr>
+            <w:tcW w:type="dxa" w:w="2000"/>
+            <w:tcBorders>
+              <w:top w:val="single" w:color="A0A0A0" w:sz="4"/>
+              <w:left w:val="single" w:color="A0A0A0" w:sz="4"/>
+              <w:bottom w:val="single" w:color="A0A0A0" w:sz="4"/>
+              <w:right w:val="single" w:color="A0A0A0" w:sz="4"/>
+            </w:tcBorders>
+            <w:tcMar>
+              <w:top w:type="dxa" w:w="60"/>
+              <w:left w:type="dxa" w:w="100"/>
+              <w:bottom w:type="dxa" w:w="60"/>
+              <w:right w:type="dxa" w:w="100"/>
+            </w:tcMar>
+          </w:tcPr>
+          <w:p>
+            <w:r>
+              <w:rPr>
+                <w:b w:val="false"/>
+                <w:bCs w:val="false"/>
+                <w:sz w:val="18"/>
+                <w:szCs w:val="18"/>
+              </w:rPr>
+              <w:t xml:space="preserve">Done</w:t>
+            </w:r>
+          </w:p>
+        </w:tc>
+      </w:tr>
+      <w:tr>
+        <w:tc>
+          <w:tcPr>
+            <w:tcW w:type="dxa" w:w="1400"/>
+            <w:tcBorders>
+              <w:top w:val="single" w:color="A0A0A0" w:sz="4"/>
+              <w:left w:val="single" w:color="A0A0A0" w:sz="4"/>
+              <w:bottom w:val="single" w:color="A0A0A0" w:sz="4"/>
+              <w:right w:val="single" w:color="A0A0A0" w:sz="4"/>
+            </w:tcBorders>
+            <w:tcMar>
+              <w:top w:type="dxa" w:w="60"/>
+              <w:left w:type="dxa" w:w="100"/>
+              <w:bottom w:type="dxa" w:w="60"/>
+              <w:right w:type="dxa" w:w="100"/>
+            </w:tcMar>
+          </w:tcPr>
+          <w:p>
+            <w:r>
+              <w:rPr>
+                <w:b w:val="false"/>
+                <w:bCs w:val="false"/>
+                <w:sz w:val="18"/>
+                <w:szCs w:val="18"/>
+              </w:rPr>
+              <w:t xml:space="preserve">18 Oct 07:35</w:t>
+            </w:r>
+          </w:p>
+        </w:tc>
+        <w:tc>
+          <w:tcPr>
+            <w:tcW w:type="dxa" w:w="4160"/>
+            <w:tcBorders>
+              <w:top w:val="single" w:color="A0A0A0" w:sz="4"/>
+              <w:left w:val="single" w:color="A0A0A0" w:sz="4"/>
+              <w:bottom w:val="single" w:color="A0A0A0" w:sz="4"/>
+              <w:right w:val="single" w:color="A0A0A0" w:sz="4"/>
+            </w:tcBorders>
+            <w:tcMar>
+              <w:top w:type="dxa" w:w="60"/>
+              <w:left w:type="dxa" w:w="100"/>
+              <w:bottom w:type="dxa" w:w="60"/>
+              <w:right w:type="dxa" w:w="100"/>
+            </w:tcMar>
+          </w:tcPr>
+          <w:p>
+            <w:r>
+              <w:rPr>
+                <w:b w:val="false"/>
+                <w:bCs w:val="false"/>
+                <w:sz w:val="18"/>
+                <w:szCs w:val="18"/>
+              </w:rPr>
+              <w:t xml:space="preserve">The first long-story runs, thought lost, were found and saved. Before the 03:51 design change, run 1 already showed shifting 59 vs label 54.5 on everyday acts: the same as the final result.</w:t>
+            </w:r>
+          </w:p>
+        </w:tc>
+        <w:tc>
+          <w:tcPr>
+            <w:tcW w:type="dxa" w:w="1800"/>
+            <w:tcBorders>
+              <w:top w:val="single" w:color="A0A0A0" w:sz="4"/>
+              <w:left w:val="single" w:color="A0A0A0" w:sz="4"/>
+              <w:bottom w:val="single" w:color="A0A0A0" w:sz="4"/>
+              <w:right w:val="single" w:color="A0A0A0" w:sz="4"/>
+            </w:tcBorders>
+            <w:tcMar>
+              <w:top w:type="dxa" w:w="60"/>
+              <w:left w:type="dxa" w:w="100"/>
+              <w:bottom w:type="dxa" w:w="60"/>
+              <w:right w:type="dxa" w:w="100"/>
+            </w:tcMar>
+          </w:tcPr>
+          <w:p>
+            <w:r>
+              <w:rPr>
+                <w:b w:val="false"/>
+                <w:bCs w:val="false"/>
+                <w:sz w:val="18"/>
+                <w:szCs w:val="18"/>
+              </w:rPr>
+              <w:t xml:space="preserve">results_long_story_v1_flawed_run1.json, _run2.json</w:t>
+            </w:r>
+          </w:p>
+        </w:tc>
+        <w:tc>
+          <w:tcPr>
+            <w:tcW w:type="dxa" w:w="2000"/>
+            <w:tcBorders>
+              <w:top w:val="single" w:color="A0A0A0" w:sz="4"/>
+              <w:left w:val="single" w:color="A0A0A0" w:sz="4"/>
+              <w:bottom w:val="single" w:color="A0A0A0" w:sz="4"/>
+              <w:right w:val="single" w:color="A0A0A0" w:sz="4"/>
+            </w:tcBorders>
+            <w:tcMar>
+              <w:top w:type="dxa" w:w="60"/>
+              <w:left w:type="dxa" w:w="100"/>
+              <w:bottom w:type="dxa" w:w="60"/>
+              <w:right w:type="dxa" w:w="100"/>
+            </w:tcMar>
+          </w:tcPr>
+          <w:p>
+            <w:r>
+              <w:rPr>
+                <w:b w:val="false"/>
+                <w:bCs w:val="false"/>
+                <w:sz w:val="18"/>
+                <w:szCs w:val="18"/>
+              </w:rPr>
+              <w:t xml:space="preserve">Good news: the 03:51 change did not create the L2 result</w:t>
+            </w:r>
+          </w:p>
+        </w:tc>
+      </w:tr>
+      <w:tr>
+        <w:tc>
+          <w:tcPr>
+            <w:tcW w:type="dxa" w:w="1400"/>
+            <w:tcBorders>
+              <w:top w:val="single" w:color="A0A0A0" w:sz="4"/>
+              <w:left w:val="single" w:color="A0A0A0" w:sz="4"/>
+              <w:bottom w:val="single" w:color="A0A0A0" w:sz="4"/>
+              <w:right w:val="single" w:color="A0A0A0" w:sz="4"/>
+            </w:tcBorders>
+            <w:tcMar>
+              <w:top w:type="dxa" w:w="60"/>
+              <w:left w:type="dxa" w:w="100"/>
+              <w:bottom w:type="dxa" w:w="60"/>
+              <w:right w:type="dxa" w:w="100"/>
+            </w:tcMar>
+          </w:tcPr>
+          <w:p>
+            <w:r>
+              <w:rPr>
+                <w:b w:val="false"/>
+                <w:bCs w:val="false"/>
+                <w:sz w:val="18"/>
+                <w:szCs w:val="18"/>
+              </w:rPr>
+              <w:t xml:space="preserve">18 Oct 07:36</w:t>
+            </w:r>
+          </w:p>
+        </w:tc>
+        <w:tc>
+          <w:tcPr>
+            <w:tcW w:type="dxa" w:w="4160"/>
+            <w:tcBorders>
+              <w:top w:val="single" w:color="A0A0A0" w:sz="4"/>
+              <w:left w:val="single" w:color="A0A0A0" w:sz="4"/>
+              <w:bottom w:val="single" w:color="A0A0A0" w:sz="4"/>
+              <w:right w:val="single" w:color="A0A0A0" w:sz="4"/>
+            </w:tcBorders>
+            <w:tcMar>
+              <w:top w:type="dxa" w:w="60"/>
+              <w:left w:type="dxa" w:w="100"/>
+              <w:bottom w:type="dxa" w:w="60"/>
+              <w:right w:type="dxa" w:w="100"/>
+            </w:tcMar>
+          </w:tcPr>
+          <w:p>
+            <w:r>
+              <w:rPr>
+                <w:b w:val="false"/>
+                <w:bCs w:val="false"/>
+                <w:sz w:val="18"/>
+                <w:szCs w:val="18"/>
+              </w:rPr>
+              <w:t xml:space="preserve">Aesop results folder delivered to the owner. Standing rules (CLAUDE.md) copied onto the research branch.</w:t>
+            </w:r>
+          </w:p>
+        </w:tc>
+        <w:tc>
+          <w:tcPr>
+            <w:tcW w:type="dxa" w:w="1800"/>
+            <w:tcBorders>
+              <w:top w:val="single" w:color="A0A0A0" w:sz="4"/>
+              <w:left w:val="single" w:color="A0A0A0" w:sz="4"/>
+              <w:bottom w:val="single" w:color="A0A0A0" w:sz="4"/>
+              <w:right w:val="single" w:color="A0A0A0" w:sz="4"/>
+            </w:tcBorders>
+            <w:tcMar>
+              <w:top w:type="dxa" w:w="60"/>
+              <w:left w:type="dxa" w:w="100"/>
+              <w:bottom w:type="dxa" w:w="60"/>
+              <w:right w:type="dxa" w:w="100"/>
+            </w:tcMar>
+          </w:tcPr>
+          <w:p>
+            <w:r>
+              <w:rPr>
+                <w:b w:val="false"/>
+                <w:bCs w:val="false"/>
+                <w:sz w:val="18"/>
+                <w:szCs w:val="18"/>
+              </w:rPr>
+              <w:t xml:space="preserve">d93b6f7, df59cfc, 49e10f0</w:t>
+            </w:r>
+          </w:p>
+          <w:p>
+            <w:r>
+              <w:rPr>
+                <w:b w:val="false"/>
+                <w:bCs w:val="false"/>
+                <w:sz w:val="18"/>
+                <w:szCs w:val="18"/>
+              </w:rPr>
+              <w:t xml:space="preserve">AESOP_RESULTS_2026-10-18/</w:t>
+            </w:r>
+          </w:p>
+        </w:tc>
+        <w:tc>
+          <w:tcPr>
+            <w:tcW w:type="dxa" w:w="2000"/>
+            <w:tcBorders>
+              <w:top w:val="single" w:color="A0A0A0" w:sz="4"/>
+              <w:left w:val="single" w:color="A0A0A0" w:sz="4"/>
+              <w:bottom w:val="single" w:color="A0A0A0" w:sz="4"/>
+              <w:right w:val="single" w:color="A0A0A0" w:sz="4"/>
+            </w:tcBorders>
+            <w:tcMar>
+              <w:top w:type="dxa" w:w="60"/>
+              <w:left w:type="dxa" w:w="100"/>
+              <w:bottom w:type="dxa" w:w="60"/>
+              <w:right w:type="dxa" w:w="100"/>
+            </w:tcMar>
+          </w:tcPr>
+          <w:p>
+            <w:r>
+              <w:rPr>
+                <w:b w:val="false"/>
+                <w:bCs w:val="false"/>
+                <w:sz w:val="18"/>
+                <w:szCs w:val="18"/>
+              </w:rPr>
+              <w:t xml:space="preserve">Done</w:t>
+            </w:r>
+          </w:p>
+        </w:tc>
+      </w:tr>
+      <w:tr>
+        <w:tc>
+          <w:tcPr>
+            <w:tcW w:type="dxa" w:w="1400"/>
+            <w:tcBorders>
+              <w:top w:val="single" w:color="A0A0A0" w:sz="4"/>
+              <w:left w:val="single" w:color="A0A0A0" w:sz="4"/>
+              <w:bottom w:val="single" w:color="A0A0A0" w:sz="4"/>
+              <w:right w:val="single" w:color="A0A0A0" w:sz="4"/>
+            </w:tcBorders>
+            <w:tcMar>
+              <w:top w:type="dxa" w:w="60"/>
+              <w:left w:type="dxa" w:w="100"/>
+              <w:bottom w:type="dxa" w:w="60"/>
+              <w:right w:type="dxa" w:w="100"/>
+            </w:tcMar>
+          </w:tcPr>
+          <w:p>
+            <w:r>
+              <w:rPr>
+                <w:b w:val="false"/>
+                <w:bCs w:val="false"/>
+                <w:sz w:val="18"/>
+                <w:szCs w:val="18"/>
+              </w:rPr>
+              <w:t xml:space="preserve">18 Oct 07:40</w:t>
+            </w:r>
+          </w:p>
+        </w:tc>
+        <w:tc>
+          <w:tcPr>
+            <w:tcW w:type="dxa" w:w="4160"/>
+            <w:tcBorders>
+              <w:top w:val="single" w:color="A0A0A0" w:sz="4"/>
+              <w:left w:val="single" w:color="A0A0A0" w:sz="4"/>
+              <w:bottom w:val="single" w:color="A0A0A0" w:sz="4"/>
+              <w:right w:val="single" w:color="A0A0A0" w:sz="4"/>
+            </w:tcBorders>
+            <w:tcMar>
+              <w:top w:type="dxa" w:w="60"/>
+              <w:left w:type="dxa" w:w="100"/>
+              <w:bottom w:type="dxa" w:w="60"/>
+              <w:right w:type="dxa" w:w="100"/>
+            </w:tcMar>
+          </w:tcPr>
+          <w:p>
+            <w:r>
+              <w:rPr>
+                <w:b w:val="false"/>
+                <w:bCs w:val="false"/>
+                <w:sz w:val="18"/>
+                <w:szCs w:val="18"/>
+              </w:rPr>
+              <w:t xml:space="preserve">This audit merged with the research branch, so everything is in one place.</w:t>
+            </w:r>
+          </w:p>
+        </w:tc>
+        <w:tc>
+          <w:tcPr>
+            <w:tcW w:type="dxa" w:w="1800"/>
+            <w:tcBorders>
+              <w:top w:val="single" w:color="A0A0A0" w:sz="4"/>
+              <w:left w:val="single" w:color="A0A0A0" w:sz="4"/>
+              <w:bottom w:val="single" w:color="A0A0A0" w:sz="4"/>
+              <w:right w:val="single" w:color="A0A0A0" w:sz="4"/>
+            </w:tcBorders>
+            <w:tcMar>
+              <w:top w:type="dxa" w:w="60"/>
+              <w:left w:type="dxa" w:w="100"/>
+              <w:bottom w:type="dxa" w:w="60"/>
+              <w:right w:type="dxa" w:w="100"/>
+            </w:tcMar>
+          </w:tcPr>
+          <w:p>
+            <w:r>
+              <w:rPr>
+                <w:b w:val="false"/>
+                <w:bCs w:val="false"/>
+                <w:sz w:val="18"/>
+                <w:szCs w:val="18"/>
+              </w:rPr>
+              <w:t xml:space="preserve">branch ccr-1be0d913-1tlzao</w:t>
             </w:r>
           </w:p>
         </w:tc>
@@ -3796,7 +4533,7 @@
                 <w:sz w:val="18"/>
                 <w:szCs w:val="18"/>
               </w:rPr>
-              <w:t xml:space="preserve">Two changes at 03:45 and 03:51, after the first scores, and the first-run results were thrown away. "Confirmed" is too strong.</w:t>
+              <w:t xml:space="preserve">Two changes at 03:45 and 03:51, after the first scores, and the first-run results were not kept at the time (recovered at 07:35). "Confirmed" is too strong.</w:t>
             </w:r>
           </w:p>
         </w:tc>
@@ -3852,7 +4589,7 @@
                 <w:sz w:val="18"/>
                 <w:szCs w:val="18"/>
               </w:rPr>
-              <w:t xml:space="preserve">Call it "supported once". Repeat it on fresh stories at several distances.</w:t>
+              <w:t xml:space="preserve">Call it "supported once" (done at 07:35). Update: the recovered run 1 shows the same gap before the change (59 vs 54.5), so the change did not create the result. It is still one set of stories: repeat on fresh stories at several distances.</w:t>
             </w:r>
           </w:p>
         </w:tc>
@@ -4366,7 +5103,7 @@
                 <w:sz w:val="18"/>
                 <w:szCs w:val="18"/>
               </w:rPr>
-              <w:t xml:space="preserve">Marker diagnostics and the first experiment-11 run were never saved. Trained models and data aren't in git, so a fresh machine must retrain (about 2.5 hours for exp 8/10).</w:t>
+              <w:t xml:space="preserve">Marker diagnostics were never saved. The first experiment-11 runs were thought lost, but were recovered at 07:35. Trained models and data aren't in git, so a fresh machine must retrain (about 2.5 hours for exp 8/10).</w:t>
             </w:r>
           </w:p>
         </w:tc>
@@ -5601,7 +6338,7 @@
                 <w:sz w:val="18"/>
                 <w:szCs w:val="18"/>
               </w:rPr>
-              <w:t xml:space="preserve">Aesop (exp 9)</w:t>
+              <w:t xml:space="preserve">Aesop (exp 9): do folk tales teach morals that transfer to fables never seen?</w:t>
             </w:r>
           </w:p>
         </w:tc>
@@ -5629,7 +6366,29 @@
                 <w:sz w:val="18"/>
                 <w:szCs w:val="18"/>
               </w:rPr>
-              <w:t xml:space="preserve">7 of 16 models in results_aesop.json</w:t>
+              <w:t xml:space="preserve">Folk tales 52.3, novels 54.1, shuffled tales 53.1, Bible 43.6 (4, 4, 4 and 2 runs)</w:t>
+            </w:r>
+          </w:p>
+          <w:p>
+            <w:r>
+              <w:rPr>
+                <w:b w:val="false"/>
+                <w:bCs w:val="false"/>
+                <w:sz w:val="18"/>
+                <w:szCs w:val="18"/>
+              </w:rPr>
+              <w:t xml:space="preserve">No-word-clue pairs: folk tales 60.2 (p = 0.065)</w:t>
+            </w:r>
+          </w:p>
+          <w:p>
+            <w:r>
+              <w:rPr>
+                <w:b w:val="false"/>
+                <w:bCs w:val="false"/>
+                <w:sz w:val="18"/>
+                <w:szCs w:val="18"/>
+              </w:rPr>
+              <w:t xml:space="preserve">A simple word-overlap count, no model, gets 76.1</w:t>
             </w:r>
           </w:p>
         </w:tc>
@@ -5657,7 +6416,7 @@
                 <w:sz w:val="18"/>
                 <w:szCs w:val="18"/>
               </w:rPr>
-              <w:t xml:space="preserve">Not analysed in this audit, so as not to peek before it finishes.</w:t>
+              <w:t xml:space="preserve">All four checks NOT CONFIRMED. Stories did not beat novels or shuffled stories, and every model did worse than plain word matching. Failure, reported plainly. Checked against results_aesop.txt.</w:t>
             </w:r>
           </w:p>
         </w:tc>
@@ -5872,7 +6631,7 @@
                 <w:sz w:val="18"/>
                 <w:szCs w:val="18"/>
               </w:rPr>
-              <w:t xml:space="preserve">ccr-1be0d913-1tlzao (NOT on main). 34 research commits, 17 Oct 21:43 to 18 Oct 05:47 UTC, plus "partial results" commits.</w:t>
+              <w:t xml:space="preserve">ccr-1be0d913-1tlzao (NOT on main). Now holds everything: research, Aesop results, this audit folder and the standing rules. Research commits run 17 Oct 21:43 to 18 Oct 07:36 UTC, plus "partial results" commits.</w:t>
             </w:r>
           </w:p>
         </w:tc>
@@ -5930,7 +6689,7 @@
                 <w:sz w:val="18"/>
                 <w:szCs w:val="18"/>
               </w:rPr>
-              <w:t xml:space="preserve">AUDIT_PACK_2026-10-18/ on branch ccr-1be0d913-audit-pack (kept separate so it can't clash with the running Aesop session).</w:t>
+              <w:t xml:space="preserve">AUDIT_PACK_2026-10-18/ at the top of the research branch ccr-1be0d913-1tlzao. The same copy is also on branch ccr-1be0d913-audit-pack.</w:t>
             </w:r>
           </w:p>
         </w:tc>
@@ -6588,7 +7347,7 @@
         <w:spacing w:after="120"/>
       </w:pPr>
       <w:r>
-        <w:t xml:space="preserve">Paths are relative to the AUDIT_PACK_2026-10-18 folder. The same folder is in the repository on branch ccr-1be0d913-audit-pack.</w:t>
+        <w:t xml:space="preserve">Paths are relative to the AUDIT_PACK_2026-10-18 folder. The same folder is at the top of the research branch ccr-1be0d913-1tlzao (and on ccr-1be0d913-audit-pack).</w:t>
       </w:r>
     </w:p>
     <w:tbl>
@@ -6841,7 +7600,7 @@
                 <w:sz w:val="18"/>
                 <w:szCs w:val="18"/>
               </w:rPr>
-              <w:t xml:space="preserve">Previous session's summary of where things stand.</w:t>
+              <w:t xml:space="preserve">Summary of where things stand (with the audit corrections applied at 07:35).</w:t>
             </w:r>
           </w:p>
         </w:tc>
@@ -6871,7 +7630,7 @@
                 <w:sz w:val="18"/>
                 <w:szCs w:val="18"/>
               </w:rPr>
-              <w:t xml:space="preserve">2_Research_Notes/COMMUNICATION_GUIDE (.docx, .md)</w:t>
+              <w:t xml:space="preserve">2_Research_Notes/as_audited_before_corrections/</w:t>
             </w:r>
           </w:p>
         </w:tc>
@@ -6899,7 +7658,7 @@
                 <w:sz w:val="18"/>
                 <w:szCs w:val="18"/>
               </w:rPr>
-              <w:t xml:space="preserve">How you explain things, and how an AI should translate them.</w:t>
+              <w:t xml:space="preserve">All six research notes exactly as they were when audited, before the corrections. Compare with the corrected versions one level up.</w:t>
             </w:r>
           </w:p>
         </w:tc>
@@ -6929,7 +7688,7 @@
                 <w:sz w:val="18"/>
                 <w:szCs w:val="18"/>
               </w:rPr>
-              <w:t xml:space="preserve">2_Research_Notes/PLAN (.docx, .md)</w:t>
+              <w:t xml:space="preserve">2_Research_Notes/COMMUNICATION_GUIDE (.docx, .md)</w:t>
             </w:r>
           </w:p>
         </w:tc>
@@ -6957,7 +7716,7 @@
                 <w:sz w:val="18"/>
                 <w:szCs w:val="18"/>
               </w:rPr>
-              <w:t xml:space="preserve">Planned next steps.</w:t>
+              <w:t xml:space="preserve">How you explain things, and how an AI should translate them.</w:t>
             </w:r>
           </w:p>
         </w:tc>
@@ -6987,7 +7746,7 @@
                 <w:sz w:val="18"/>
                 <w:szCs w:val="18"/>
               </w:rPr>
-              <w:t xml:space="preserve">2_Research_Notes/README (.docx, .md)</w:t>
+              <w:t xml:space="preserve">2_Research_Notes/PLAN (.docx, .md)</w:t>
             </w:r>
           </w:p>
         </w:tc>
@@ -7015,7 +7774,7 @@
                 <w:sz w:val="18"/>
                 <w:szCs w:val="18"/>
               </w:rPr>
-              <w:t xml:space="preserve">Full write-up of every experiment.</w:t>
+              <w:t xml:space="preserve">Planned next steps.</w:t>
             </w:r>
           </w:p>
         </w:tc>
@@ -7045,7 +7804,7 @@
                 <w:sz w:val="18"/>
                 <w:szCs w:val="18"/>
               </w:rPr>
-              <w:t xml:space="preserve">2_Research_Notes/PRIOR_WORK (.docx, .md)</w:t>
+              <w:t xml:space="preserve">2_Research_Notes/README (.docx, .md)</w:t>
             </w:r>
           </w:p>
         </w:tc>
@@ -7073,7 +7832,7 @@
                 <w:sz w:val="18"/>
                 <w:szCs w:val="18"/>
               </w:rPr>
-              <w:t xml:space="preserve">Related published research, and what looks new.</w:t>
+              <w:t xml:space="preserve">Full write-up of every experiment.</w:t>
             </w:r>
           </w:p>
         </w:tc>
@@ -7103,7 +7862,7 @@
                 <w:sz w:val="18"/>
                 <w:szCs w:val="18"/>
               </w:rPr>
-              <w:t xml:space="preserve">2_Research_Notes/NEXT_SESSION_PROMPT (.docx, .md)</w:t>
+              <w:t xml:space="preserve">2_Research_Notes/PRIOR_WORK (.docx, .md)</w:t>
             </w:r>
           </w:p>
         </w:tc>
@@ -7131,7 +7890,7 @@
                 <w:sz w:val="18"/>
                 <w:szCs w:val="18"/>
               </w:rPr>
-              <w:t xml:space="preserve">Prompt used to start new sessions.</w:t>
+              <w:t xml:space="preserve">Related published research, and what looks new.</w:t>
             </w:r>
           </w:p>
         </w:tc>
@@ -7161,7 +7920,7 @@
                 <w:sz w:val="18"/>
                 <w:szCs w:val="18"/>
               </w:rPr>
-              <w:t xml:space="preserve">3_Code/*.py</w:t>
+              <w:t xml:space="preserve">2_Research_Notes/NEXT_SESSION_PROMPT (.docx, .md)</w:t>
             </w:r>
           </w:p>
         </w:tc>
@@ -7189,7 +7948,7 @@
                 <w:sz w:val="18"/>
                 <w:szCs w:val="18"/>
               </w:rPr>
-              <w:t xml:space="preserve">All experiment scripts (experiments 1-11), plus the early resonance engine in 3_Code/resonance/.</w:t>
+              <w:t xml:space="preserve">Prompt used to start new sessions.</w:t>
             </w:r>
           </w:p>
         </w:tc>
@@ -7219,7 +7978,7 @@
                 <w:sz w:val="18"/>
                 <w:szCs w:val="18"/>
               </w:rPr>
-              <w:t xml:space="preserve">4_Raw_Results/results_*.json, *.txt</w:t>
+              <w:t xml:space="preserve">3_Code/*.py</w:t>
             </w:r>
           </w:p>
         </w:tc>
@@ -7247,7 +8006,7 @@
                 <w:sz w:val="18"/>
                 <w:szCs w:val="18"/>
               </w:rPr>
-              <w:t xml:space="preserve">Raw scores every claim is based on. results_aesop.json is partial (Aesop still running).</w:t>
+              <w:t xml:space="preserve">All experiment scripts (experiments 1-11), plus the early resonance engine in 3_Code/resonance/.</w:t>
             </w:r>
           </w:p>
         </w:tc>
@@ -7277,7 +8036,7 @@
                 <w:sz w:val="18"/>
                 <w:szCs w:val="18"/>
               </w:rPr>
-              <w:t xml:space="preserve">5_Other_Master_Files/MASTER_PATENT_READY_THEORY.docx</w:t>
+              <w:t xml:space="preserve">4_Raw_Results/results_*.json, *.txt</w:t>
             </w:r>
           </w:p>
         </w:tc>
@@ -7305,7 +8064,7 @@
                 <w:sz w:val="18"/>
                 <w:szCs w:val="18"/>
               </w:rPr>
-              <w:t xml:space="preserve">Zine project master file, converted to a real Word file so it opens anywhere.</w:t>
+              <w:t xml:space="preserve">Raw scores every claim is based on. Includes the final Aesop results (results_aesop.json, results_aesop.txt) and the recovered first long-story runs (results_long_story_v1_flawed_run1.json, _run2.json).</w:t>
             </w:r>
           </w:p>
         </w:tc>
@@ -7335,7 +8094,7 @@
                 <w:sz w:val="18"/>
                 <w:szCs w:val="18"/>
               </w:rPr>
-              <w:t xml:space="preserve">5_Other_Master_Files/..._original_webpage.doc</w:t>
+              <w:t xml:space="preserve">5_Other_Master_Files/MASTER_PATENT_READY_THEORY.docx</w:t>
             </w:r>
           </w:p>
         </w:tc>
@@ -7363,7 +8122,7 @@
                 <w:sz w:val="18"/>
                 <w:szCs w:val="18"/>
               </w:rPr>
-              <w:t xml:space="preserve">The original file as made (a web page with a .doc name). Kept for the record.</w:t>
+              <w:t xml:space="preserve">Zine project master file, converted to a real Word file so it opens anywhere.</w:t>
             </w:r>
           </w:p>
         </w:tc>
@@ -7393,6 +8152,64 @@
                 <w:sz w:val="18"/>
                 <w:szCs w:val="18"/>
               </w:rPr>
+              <w:t xml:space="preserve">5_Other_Master_Files/..._original_webpage.doc</w:t>
+            </w:r>
+          </w:p>
+        </w:tc>
+        <w:tc>
+          <w:tcPr>
+            <w:tcW w:type="dxa" w:w="5560"/>
+            <w:tcBorders>
+              <w:top w:val="single" w:color="A0A0A0" w:sz="4"/>
+              <w:left w:val="single" w:color="A0A0A0" w:sz="4"/>
+              <w:bottom w:val="single" w:color="A0A0A0" w:sz="4"/>
+              <w:right w:val="single" w:color="A0A0A0" w:sz="4"/>
+            </w:tcBorders>
+            <w:tcMar>
+              <w:top w:type="dxa" w:w="60"/>
+              <w:left w:type="dxa" w:w="100"/>
+              <w:bottom w:type="dxa" w:w="60"/>
+              <w:right w:type="dxa" w:w="100"/>
+            </w:tcMar>
+          </w:tcPr>
+          <w:p>
+            <w:r>
+              <w:rPr>
+                <w:b w:val="false"/>
+                <w:bCs w:val="false"/>
+                <w:sz w:val="18"/>
+                <w:szCs w:val="18"/>
+              </w:rPr>
+              <w:t xml:space="preserve">The original file as made (a web page with a .doc name). Kept for the record.</w:t>
+            </w:r>
+          </w:p>
+        </w:tc>
+      </w:tr>
+      <w:tr>
+        <w:tc>
+          <w:tcPr>
+            <w:tcW w:type="dxa" w:w="3800"/>
+            <w:tcBorders>
+              <w:top w:val="single" w:color="A0A0A0" w:sz="4"/>
+              <w:left w:val="single" w:color="A0A0A0" w:sz="4"/>
+              <w:bottom w:val="single" w:color="A0A0A0" w:sz="4"/>
+              <w:right w:val="single" w:color="A0A0A0" w:sz="4"/>
+            </w:tcBorders>
+            <w:tcMar>
+              <w:top w:type="dxa" w:w="60"/>
+              <w:left w:type="dxa" w:w="100"/>
+              <w:bottom w:type="dxa" w:w="60"/>
+              <w:right w:type="dxa" w:w="100"/>
+            </w:tcMar>
+          </w:tcPr>
+          <w:p>
+            <w:r>
+              <w:rPr>
+                <w:b w:val="false"/>
+                <w:bCs w:val="false"/>
+                <w:sz w:val="18"/>
+                <w:szCs w:val="18"/>
+              </w:rPr>
               <w:t xml:space="preserve">7_Strict_File_Rules (.docx, .md)</w:t>
             </w:r>
           </w:p>
@@ -7422,6 +8239,64 @@
                 <w:szCs w:val="18"/>
               </w:rPr>
               <w:t xml:space="preserve">Your standing rules for every AI session: real files saved into the folder as they are made, never links, nothing locked or permission-blocked. Same text as CLAUDE.md at the top of the repo, which sessions read automatically.</w:t>
+            </w:r>
+          </w:p>
+        </w:tc>
+      </w:tr>
+      <w:tr>
+        <w:tc>
+          <w:tcPr>
+            <w:tcW w:type="dxa" w:w="3800"/>
+            <w:tcBorders>
+              <w:top w:val="single" w:color="A0A0A0" w:sz="4"/>
+              <w:left w:val="single" w:color="A0A0A0" w:sz="4"/>
+              <w:bottom w:val="single" w:color="A0A0A0" w:sz="4"/>
+              <w:right w:val="single" w:color="A0A0A0" w:sz="4"/>
+            </w:tcBorders>
+            <w:tcMar>
+              <w:top w:type="dxa" w:w="60"/>
+              <w:left w:type="dxa" w:w="100"/>
+              <w:bottom w:type="dxa" w:w="60"/>
+              <w:right w:type="dxa" w:w="100"/>
+            </w:tcMar>
+          </w:tcPr>
+          <w:p>
+            <w:r>
+              <w:rPr>
+                <w:b w:val="false"/>
+                <w:bCs w:val="false"/>
+                <w:sz w:val="18"/>
+                <w:szCs w:val="18"/>
+              </w:rPr>
+              <w:t xml:space="preserve">9_Aesop_Results_copy/</w:t>
+            </w:r>
+          </w:p>
+        </w:tc>
+        <w:tc>
+          <w:tcPr>
+            <w:tcW w:type="dxa" w:w="5560"/>
+            <w:tcBorders>
+              <w:top w:val="single" w:color="A0A0A0" w:sz="4"/>
+              <w:left w:val="single" w:color="A0A0A0" w:sz="4"/>
+              <w:bottom w:val="single" w:color="A0A0A0" w:sz="4"/>
+              <w:right w:val="single" w:color="A0A0A0" w:sz="4"/>
+            </w:tcBorders>
+            <w:tcMar>
+              <w:top w:type="dxa" w:w="60"/>
+              <w:left w:type="dxa" w:w="100"/>
+              <w:bottom w:type="dxa" w:w="60"/>
+              <w:right w:type="dxa" w:w="100"/>
+            </w:tcMar>
+          </w:tcPr>
+          <w:p>
+            <w:r>
+              <w:rPr>
+                <w:b w:val="false"/>
+                <w:bCs w:val="false"/>
+                <w:sz w:val="18"/>
+                <w:szCs w:val="18"/>
+              </w:rPr>
+              <w:t xml:space="preserve">Full copy of the Aesop results folder made by the test session (its own start-here guide, write-up in Word, raw results, code). The original is AESOP_RESULTS_2026-10-18/ at the top of the research branch.</w:t>
             </w:r>
           </w:p>
         </w:tc>

</xml_diff>